<commit_message>
Rebuild Ch07 The Union Breaks worksheets: add student work + teacher answer keys
Co-Authored-By: Claude Opus 4.8 <noreply@anthropic.com>
Claude-Session: https://claude.ai/code/session_015FDXZfxhU1Z58uEGaySNHv
</commit_message>
<xml_diff>
--- a/Part-Two-Ch07-The-Union-Breaks/Andersonville.docx
+++ b/Part-Two-Ch07-The-Union-Breaks/Andersonville.docx
@@ -9,25 +9,22 @@
         <w:tblLook w:firstColumn="1" w:firstRow="1" w:lastColumn="0" w:lastRow="0" w:noHBand="0" w:noVBand="1" w:val="04A0"/>
       </w:tblPr>
       <w:tblGrid>
-        <w:gridCol w:w="9936"/>
+        <w:gridCol w:w="10224"/>
       </w:tblGrid>
       <w:tr>
         <w:tc>
           <w:tcPr>
-            <w:tcW w:type="dxa" w:w="9936"/>
+            <w:tcW w:type="dxa" w:w="10224"/>
             <w:shd w:val="clear" w:fill="B1442F"/>
           </w:tcPr>
           <w:p>
-            <w:pPr>
-              <w:jc w:val="left"/>
-            </w:pPr>
             <w:r>
               <w:rPr>
                 <w:b/>
                 <w:color w:val="FFE6DE"/>
                 <w:sz w:val="18"/>
               </w:rPr>
-              <w:t>CHAPTER 7 · DEEP DIVE · A HOUSE DIVIDED</w:t>
+              <w:t>PROMISE &amp; PRACTICE  ·  DEEP DIVE  ·  SOURCE ANALYSIS</w:t>
             </w:r>
           </w:p>
           <w:p>
@@ -35,18 +32,19 @@
               <w:rPr>
                 <w:b/>
                 <w:color w:val="FFFFFF"/>
-                <w:sz w:val="40"/>
+                <w:sz w:val="42"/>
               </w:rPr>
-              <w:t>Andersonville</w:t>
+              <w:t>Andersonville — A House Divided</w:t>
             </w:r>
           </w:p>
           <w:p>
             <w:r>
               <w:rPr>
+                <w:i/>
                 <w:color w:val="FFE6DE"/>
-                <w:sz w:val="21"/>
+                <w:sz w:val="22"/>
               </w:rPr>
-              <w:t>Inside the Confederacy's most notorious prison camp, where thousands of Union soldiers died of hunger and disease. 1864–1865.</w:t>
+              <w:t>Understanding Andersonville</w:t>
             </w:r>
           </w:p>
         </w:tc>
@@ -64,7 +62,7 @@
         <w:rPr>
           <w:sz w:val="21"/>
         </w:rPr>
-        <w:t xml:space="preserve">__________________________    </w:t>
+        <w:t xml:space="preserve">______________________________    </w:t>
       </w:r>
       <w:r>
         <w:rPr>
@@ -90,30 +88,251 @@
         <w:rPr>
           <w:sz w:val="21"/>
         </w:rPr>
-        <w:t>______________</w:t>
+        <w:t>________________</w:t>
+      </w:r>
+    </w:p>
+    <w:tbl>
+      <w:tblPr>
+        <w:tblW w:type="auto" w:w="0"/>
+        <w:tblLayout w:type="autofit"/>
+        <w:tblLook w:firstColumn="1" w:firstRow="1" w:lastColumn="0" w:lastRow="0" w:noHBand="0" w:noVBand="1" w:val="04A0"/>
+      </w:tblPr>
+      <w:tblGrid>
+        <w:gridCol w:w="10224"/>
+      </w:tblGrid>
+      <w:tr>
+        <w:tc>
+          <w:tcPr>
+            <w:tcW w:type="dxa" w:w="10224"/>
+            <w:shd w:val="clear" w:fill="f4c04e"/>
+          </w:tcPr>
+          <w:p>
+            <w:r>
+              <w:rPr>
+                <w:b/>
+                <w:color w:val="5A4512"/>
+                <w:sz w:val="19"/>
+              </w:rPr>
+              <w:t xml:space="preserve">WHAT I CAN DO TODAY   </w:t>
+            </w:r>
+            <w:r>
+              <w:rPr>
+                <w:color w:val="5A4512"/>
+                <w:sz w:val="21"/>
+              </w:rPr>
+              <w:t>I can read primary sources about Andersonville — A House Divided, weigh who made each one and why, and use evidence to answer historical questions.</w:t>
+            </w:r>
+          </w:p>
+        </w:tc>
+      </w:tr>
+    </w:tbl>
+    <w:p>
+      <w:r>
+        <w:rPr>
+          <w:b/>
+          <w:color w:val="B1442F"/>
+        </w:rPr>
+        <w:t xml:space="preserve">Directions. </w:t>
+      </w:r>
+      <w:r>
+        <w:rPr>
+          <w:sz w:val="22"/>
+        </w:rPr>
+        <w:t>Two habits at once: feel the human reality behind the numbers, and judge responsibility by the evidence — not by anger alone</w:t>
       </w:r>
     </w:p>
     <w:p/>
     <w:p>
       <w:r>
         <w:rPr>
+          <w:b/>
+          <w:color w:val="B1442F"/>
+          <w:sz w:val="26"/>
+        </w:rPr>
+        <w:t>THE SOURCES</w:t>
+      </w:r>
+    </w:p>
+    <w:p>
+      <w:pPr>
+        <w:spacing w:before="160"/>
+      </w:pPr>
+      <w:r>
+        <w:rPr>
+          <w:b/>
+          <w:color w:val="1C1714"/>
+          <w:sz w:val="23"/>
+        </w:rPr>
+        <w:t>SOURCE A · THE PHOTOGRAPH · AUGUST 1864  —  The stockade, at its worst</w:t>
+      </w:r>
+    </w:p>
+    <w:p>
+      <w:pPr>
+        <w:jc w:val="center"/>
+      </w:pPr>
+      <w:r>
+        <w:drawing>
+          <wp:inline xmlns:a="http://schemas.openxmlformats.org/drawingml/2006/main" xmlns:pic="http://schemas.openxmlformats.org/drawingml/2006/picture">
+            <wp:extent cx="3931920" cy="2441722"/>
+            <wp:docPr id="1" name="Picture 1"/>
+            <wp:cNvGraphicFramePr>
+              <a:graphicFrameLocks noChangeAspect="1"/>
+            </wp:cNvGraphicFramePr>
+            <a:graphic>
+              <a:graphicData uri="http://schemas.openxmlformats.org/drawingml/2006/picture">
+                <pic:pic>
+                  <pic:nvPicPr>
+                    <pic:cNvPr id="0" name="image.jpg"/>
+                    <pic:cNvPicPr/>
+                  </pic:nvPicPr>
+                  <pic:blipFill>
+                    <a:blip r:embed="rId9"/>
+                    <a:stretch>
+                      <a:fillRect/>
+                    </a:stretch>
+                  </pic:blipFill>
+                  <pic:spPr>
+                    <a:xfrm>
+                      <a:off x="0" y="0"/>
+                      <a:ext cx="3931920" cy="2441722"/>
+                    </a:xfrm>
+                    <a:prstGeom prst="rect"/>
+                  </pic:spPr>
+                </pic:pic>
+              </a:graphicData>
+            </a:graphic>
+          </wp:inline>
+        </w:drawing>
+      </w:r>
+    </w:p>
+    <w:p>
+      <w:r>
+        <w:rPr>
+          <w:color w:val="6A6256"/>
+          <w:sz w:val="17"/>
+        </w:rPr>
+        <w:t>Andersonville Prison, Georgia — photograph by A. J. Riddle, August 1864, public domain (Library of Congress).</w:t>
+      </w:r>
+    </w:p>
+    <w:p>
+      <w:pPr>
+        <w:spacing w:before="160"/>
+      </w:pPr>
+      <w:r>
+        <w:rPr>
+          <w:b/>
+          <w:color w:val="1C1714"/>
+          <w:sz w:val="23"/>
+        </w:rPr>
+        <w:t>SOURCE B · A SURVIVOR'S TESTIMONY  —  Inside the fence</w:t>
+      </w:r>
+    </w:p>
+    <w:p>
+      <w:pPr>
+        <w:ind w:left="432"/>
+      </w:pPr>
+      <w:r>
+        <w:rPr>
           <w:i/>
           <w:color w:val="1C1714"/>
           <w:sz w:val="22"/>
         </w:rPr>
-        <w:t>Inside the Confederacy's most notorious prison camp, where thousands of Union soldiers died of hunger and disease. 1864–1865.</w:t>
+        <w:t>“There was no shade … no shelter from the burning sun or the drenching rain. … Men died at the rate of a hundred a day, and we buried them in long trenches, side by side.”</w:t>
+        <w:br/>
+        <w:t>— account of an Andersonville survivor. Public domain</w:t>
+      </w:r>
+    </w:p>
+    <w:p>
+      <w:r>
+        <w:rPr>
+          <w:color w:val="6A6256"/>
+          <w:sz w:val="17"/>
+        </w:rPr>
+        <w:t>— account of an Andersonville survivor. Public domain.</w:t>
       </w:r>
     </w:p>
     <w:p>
       <w:pPr>
-        <w:spacing w:after="80"/>
+        <w:spacing w:before="160"/>
       </w:pPr>
       <w:r>
         <w:rPr>
+          <w:b/>
           <w:color w:val="1C1714"/>
           <w:sz w:val="23"/>
         </w:rPr>
-        <w:t>When a place produces unbearable suffering, how does a historian decide what — and who — was to blame?</w:t>
+        <w:t>SOURCE C · RELICS, PHOTOGRAPHED LATER  —  The “Dead Line”</w:t>
+      </w:r>
+    </w:p>
+    <w:p>
+      <w:pPr>
+        <w:jc w:val="center"/>
+      </w:pPr>
+      <w:r>
+        <w:drawing>
+          <wp:inline xmlns:a="http://schemas.openxmlformats.org/drawingml/2006/main" xmlns:pic="http://schemas.openxmlformats.org/drawingml/2006/picture">
+            <wp:extent cx="3931920" cy="5142951"/>
+            <wp:docPr id="2" name="Picture 2"/>
+            <wp:cNvGraphicFramePr>
+              <a:graphicFrameLocks noChangeAspect="1"/>
+            </wp:cNvGraphicFramePr>
+            <a:graphic>
+              <a:graphicData uri="http://schemas.openxmlformats.org/drawingml/2006/picture">
+                <pic:pic>
+                  <pic:nvPicPr>
+                    <pic:cNvPr id="0" name="image.jpg"/>
+                    <pic:cNvPicPr/>
+                  </pic:nvPicPr>
+                  <pic:blipFill>
+                    <a:blip r:embed="rId10"/>
+                    <a:stretch>
+                      <a:fillRect/>
+                    </a:stretch>
+                  </pic:blipFill>
+                  <pic:spPr>
+                    <a:xfrm>
+                      <a:off x="0" y="0"/>
+                      <a:ext cx="3931920" cy="5142951"/>
+                    </a:xfrm>
+                    <a:prstGeom prst="rect"/>
+                  </pic:spPr>
+                </pic:pic>
+              </a:graphicData>
+            </a:graphic>
+          </wp:inline>
+        </w:drawing>
+      </w:r>
+    </w:p>
+    <w:p>
+      <w:pPr>
+        <w:ind w:left="432"/>
+      </w:pPr>
+      <w:r>
+        <w:rPr>
+          <w:i/>
+          <w:color w:val="1C1714"/>
+          <w:sz w:val="22"/>
+        </w:rPr>
+        <w:t>A line inside the fence marked the “dead line.” Any prisoner who crossed it — even reaching for clean water — was shot by the guards</w:t>
+      </w:r>
+    </w:p>
+    <w:p>
+      <w:r>
+        <w:rPr>
+          <w:color w:val="6A6256"/>
+          <w:sz w:val="17"/>
+        </w:rPr>
+        <w:t>Relics of Andersonville — the “Dead Line” post and the prison mail box — photograph, public domain (Library of Congress).</w:t>
+      </w:r>
+    </w:p>
+    <w:p/>
+    <w:p>
+      <w:r>
+        <w:rPr>
+          <w:b/>
+          <w:color w:val="B1442F"/>
+          <w:sz w:val="26"/>
+        </w:rPr>
+        <w:t>YOUR WORK</w:t>
       </w:r>
     </w:p>
     <w:p>
@@ -123,54 +342,65 @@
       <w:r>
         <w:rPr>
           <w:b/>
-          <w:color w:val="B1442F"/>
-          <w:sz w:val="28"/>
+          <w:color w:val="FFFFFF"/>
+          <w:sz w:val="20"/>
+          <w:shd w:val="clear" w:fill="B1442F"/>
         </w:rPr>
-        <w:t>A Camp Built to Overflow</w:t>
+        <w:t xml:space="preserve">  QUESTION 1  </w:t>
+      </w:r>
+      <w:r>
+        <w:rPr>
+          <w:b/>
+          <w:color w:val="6A6256"/>
+          <w:sz w:val="18"/>
+        </w:rPr>
+        <w:t xml:space="preserve">   STEP 1 · HISTORICAL EMPATHY</w:t>
       </w:r>
     </w:p>
     <w:p>
       <w:r>
         <w:rPr>
-          <w:b/>
-          <w:color w:val="6A6256"/>
-          <w:sz w:val="17"/>
+          <w:b w:val="0"/>
+          <w:color w:val="1C1714"/>
+          <w:sz w:val="23"/>
         </w:rPr>
-        <w:t>1864</w:t>
+        <w:t>Read Source B and study Source A together. In your own words, describe what daily life inside Andersonville was like. What did the men lack that they needed simply to survive?</w:t>
       </w:r>
     </w:p>
     <w:p>
       <w:pPr>
-        <w:spacing w:after="80"/>
+        <w:spacing w:after="120"/>
       </w:pPr>
       <w:r>
         <w:rPr>
-          <w:color w:val="1C1714"/>
-          <w:sz w:val="23"/>
+          <w:color w:val="9A9286"/>
+          <w:sz w:val="22"/>
         </w:rPr>
-        <w:t>As prisoner exchanges broke down in 1864, both sides crowded captured soldiers into camps neither could properly feed. The worst was Andersonville, in Georgia — a stockade built for about 10,000 men that was soon packed with more than 30,000.</w:t>
+        <w:t>____________________________________________________________________________________________</w:t>
       </w:r>
     </w:p>
     <w:p>
       <w:pPr>
-        <w:spacing w:after="80"/>
+        <w:spacing w:after="120"/>
       </w:pPr>
       <w:r>
         <w:rPr>
-          <w:color w:val="1C1714"/>
-          <w:sz w:val="23"/>
+          <w:color w:val="9A9286"/>
+          <w:sz w:val="22"/>
         </w:rPr>
-        <w:t>There was little shelter, foul water, and almost no medicine. A line inside the fence called the “dead line” marked a boundary: cross it, and guards would shoot.</w:t>
+        <w:t>____________________________________________________________________________________________</w:t>
       </w:r>
     </w:p>
     <w:p>
+      <w:pPr>
+        <w:spacing w:after="120"/>
+      </w:pPr>
       <w:r>
         <w:rPr>
-          <w:i/>
-          <w:color w:val="6A6256"/>
-          <w:sz w:val="17"/>
+          <w:color w:val="9A9286"/>
+          <w:sz w:val="22"/>
         </w:rPr>
-        <w:t>Andersonville Prison, Georgia — the overcrowded stockade — photograph, August 1864, public domain (Library of Congress).</w:t>
+        <w:t>____________________________________________________________________________________________</w:t>
       </w:r>
     </w:p>
     <w:p>
@@ -180,40 +410,77 @@
       <w:r>
         <w:rPr>
           <w:b/>
-          <w:color w:val="B1442F"/>
-          <w:sz w:val="28"/>
+          <w:color w:val="FFFFFF"/>
+          <w:sz w:val="20"/>
+          <w:shd w:val="clear" w:fill="B1442F"/>
         </w:rPr>
-        <w:t>Inside the Stockade</w:t>
+        <w:t xml:space="preserve">  QUESTION 2  </w:t>
+      </w:r>
+      <w:r>
+        <w:rPr>
+          <w:b/>
+          <w:color w:val="6A6256"/>
+          <w:sz w:val="18"/>
+        </w:rPr>
+        <w:t xml:space="preserve">   STEP 2 · READ THE DATA</w:t>
       </w:r>
     </w:p>
     <w:p>
       <w:r>
         <w:rPr>
-          <w:b/>
-          <w:color w:val="6A6256"/>
-          <w:sz w:val="17"/>
+          <w:b w:val="0"/>
+          <w:color w:val="1C1714"/>
+          <w:sz w:val="23"/>
         </w:rPr>
-        <w:t>A. J. RIDDLE · AUGUST 1864</w:t>
+        <w:t>Of about 45,000 prisoners, nearly 13,000 died — close to a 29% death rate. Which statement best uses this number as evidence?</w:t>
       </w:r>
     </w:p>
     <w:p>
+      <w:pPr>
+        <w:spacing w:after="40"/>
+        <w:ind w:left="432"/>
+      </w:pPr>
       <w:r>
         <w:rPr>
-          <w:i/>
-          <w:color w:val="1C1714"/>
           <w:sz w:val="22"/>
         </w:rPr>
-        <w:t>This photograph shows the camp at its deadliest, packed with makeshift tents called ‘shebangs.’ Of the roughly 45,000 men held here, nearly 13,000 died.</w:t>
+        <w:t>☐  A.  it proves the camp was comfortable</w:t>
       </w:r>
     </w:p>
     <w:p>
+      <w:pPr>
+        <w:spacing w:after="40"/>
+        <w:ind w:left="432"/>
+      </w:pPr>
       <w:r>
         <w:rPr>
-          <w:i/>
-          <w:color w:val="6A6256"/>
-          <w:sz w:val="17"/>
+          <w:sz w:val="22"/>
         </w:rPr>
-        <w:t>Andersonville Prison, Georgia — photograph by A. J. Riddle, August 1864, public domain (Library of Congress).</w:t>
+        <w:t>☐  B.  a death rate near one in three is powerful evidence of catastrophic, deadly conditions</w:t>
+      </w:r>
+    </w:p>
+    <w:p>
+      <w:pPr>
+        <w:spacing w:after="40"/>
+        <w:ind w:left="432"/>
+      </w:pPr>
+      <w:r>
+        <w:rPr>
+          <w:sz w:val="22"/>
+        </w:rPr>
+        <w:t>☐  C.  it proves no one really suffered</w:t>
+      </w:r>
+    </w:p>
+    <w:p>
+      <w:pPr>
+        <w:spacing w:after="40"/>
+        <w:ind w:left="432"/>
+      </w:pPr>
+      <w:r>
+        <w:rPr>
+          <w:sz w:val="22"/>
+        </w:rPr>
+        <w:t>☐  D.  numbers can never be used as evidence</w:t>
       </w:r>
     </w:p>
     <w:p>
@@ -223,54 +490,77 @@
       <w:r>
         <w:rPr>
           <w:b/>
-          <w:color w:val="B1442F"/>
-          <w:sz w:val="28"/>
+          <w:color w:val="FFFFFF"/>
+          <w:sz w:val="20"/>
+          <w:shd w:val="clear" w:fill="B1442F"/>
         </w:rPr>
-        <w:t>~13,000</w:t>
+        <w:t xml:space="preserve">  QUESTION 3  </w:t>
+      </w:r>
+      <w:r>
+        <w:rPr>
+          <w:b/>
+          <w:color w:val="6A6256"/>
+          <w:sz w:val="18"/>
+        </w:rPr>
+        <w:t xml:space="preserve">   STEP 3 · ASSIGN RESPONSIBILITY</w:t>
       </w:r>
     </w:p>
     <w:p>
       <w:r>
         <w:rPr>
-          <w:b/>
-          <w:color w:val="6A6256"/>
-          <w:sz w:val="17"/>
+          <w:b w:val="0"/>
+          <w:color w:val="1C1714"/>
+          <w:sz w:val="23"/>
         </w:rPr>
-        <w:t>THE TOLL AT ANDERSONVILLE</w:t>
+        <w:t>Historians debate who was to blame: the camp commander, the collapsing Confederacy that couldn't feed anyone, or the breakdown of prisoner exchanges on both sides. Weigh these explanations — which do you find most convincing, and what evidence would you want to decide?</w:t>
       </w:r>
     </w:p>
     <w:p>
       <w:pPr>
-        <w:spacing w:after="80"/>
+        <w:spacing w:after="120"/>
       </w:pPr>
       <w:r>
         <w:rPr>
-          <w:color w:val="1C1714"/>
-          <w:sz w:val="23"/>
+          <w:color w:val="9A9286"/>
+          <w:sz w:val="22"/>
         </w:rPr>
-        <w:t>Of the roughly 45,000 Union prisoners held at Andersonville over 14 months, nearly 13,000 died — most from disease, exposure, and starvation.</w:t>
+        <w:t>____________________________________________________________________________________________</w:t>
       </w:r>
     </w:p>
     <w:p>
       <w:pPr>
-        <w:spacing w:after="80"/>
+        <w:spacing w:after="120"/>
       </w:pPr>
       <w:r>
         <w:rPr>
-          <w:color w:val="1C1714"/>
-          <w:sz w:val="23"/>
+          <w:color w:val="9A9286"/>
+          <w:sz w:val="22"/>
         </w:rPr>
-        <w:t>That is a death rate of almost 29%. Survivors came home as living skeletons, and their photographs shocked the North as deeply as the images of the battlefield dead.</w:t>
+        <w:t>____________________________________________________________________________________________</w:t>
       </w:r>
     </w:p>
     <w:p>
+      <w:pPr>
+        <w:spacing w:after="120"/>
+      </w:pPr>
       <w:r>
         <w:rPr>
-          <w:i/>
-          <w:color w:val="6A6256"/>
-          <w:sz w:val="17"/>
+          <w:color w:val="9A9286"/>
+          <w:sz w:val="22"/>
         </w:rPr>
-        <w:t>A released Union prisoner from Andersonville — photograph, 1865, public domain (U.S. National Archives).</w:t>
+        <w:t>____________________________________________________________________________________________</w:t>
+      </w:r>
+    </w:p>
+    <w:p>
+      <w:pPr>
+        <w:spacing w:after="120"/>
+      </w:pPr>
+      <w:r>
+        <w:rPr>
+          <w:color w:val="9A9286"/>
+          <w:sz w:val="22"/>
+        </w:rPr>
+        <w:t>____________________________________________________________________________________________</w:t>
       </w:r>
     </w:p>
     <w:p>
@@ -280,212 +570,79 @@
       <w:r>
         <w:rPr>
           <w:b/>
-          <w:color w:val="B1442F"/>
-          <w:sz w:val="28"/>
+          <w:color w:val="FFFFFF"/>
+          <w:sz w:val="20"/>
+          <w:shd w:val="clear" w:fill="B1442F"/>
         </w:rPr>
-        <w:t>What Starvation Did</w:t>
+        <w:t xml:space="preserve">  QUESTION 4  </w:t>
+      </w:r>
+      <w:r>
+        <w:rPr>
+          <w:b/>
+          <w:color w:val="6A6256"/>
+          <w:sz w:val="18"/>
+        </w:rPr>
+        <w:t xml:space="preserve">   STEP 4 · WHY IT MATTERS</w:t>
       </w:r>
     </w:p>
     <w:p>
       <w:r>
         <w:rPr>
-          <w:b/>
-          <w:color w:val="6A6256"/>
-          <w:sz w:val="17"/>
+          <w:b w:val="0"/>
+          <w:color w:val="1C1714"/>
+          <w:sz w:val="23"/>
         </w:rPr>
-        <w:t>AFTER RELEASE · 1865</w:t>
-      </w:r>
-    </w:p>
-    <w:p>
-      <w:r>
-        <w:rPr>
-          <w:i/>
-          <w:color w:val="1C1714"/>
-          <w:sz w:val="22"/>
-        </w:rPr>
-        <w:t>Photographs of released prisoners, published after the war, horrified the North and fueled demands that someone be held to account for the camp.</w:t>
-      </w:r>
-    </w:p>
-    <w:p>
-      <w:r>
-        <w:rPr>
-          <w:i/>
-          <w:color w:val="6A6256"/>
-          <w:sz w:val="17"/>
-        </w:rPr>
-        <w:t>A released Union prisoner from Andersonville — photograph, 1865, public domain (U.S. National Archives).</w:t>
+        <w:t>Mature historical thinking can hold two truths at once: a real atrocity happened, and its causes were complex. In two or three sentences, explain why it matters that we study Andersonville carefully instead of using it simply to paint one side as pure villains.</w:t>
       </w:r>
     </w:p>
     <w:p>
       <w:pPr>
-        <w:spacing w:before="200"/>
+        <w:spacing w:after="120"/>
       </w:pPr>
       <w:r>
         <w:rPr>
-          <w:b/>
-          <w:color w:val="B1442F"/>
-          <w:sz w:val="28"/>
+          <w:color w:val="9A9286"/>
+          <w:sz w:val="22"/>
         </w:rPr>
-        <w:t>Who Was Responsible?</w:t>
-      </w:r>
-    </w:p>
-    <w:p>
-      <w:r>
-        <w:rPr>
-          <w:b/>
-          <w:color w:val="6A6256"/>
-          <w:sz w:val="17"/>
-        </w:rPr>
-        <w:t>THE RECKONING</w:t>
+        <w:t>____________________________________________________________________________________________</w:t>
       </w:r>
     </w:p>
     <w:p>
       <w:pPr>
-        <w:spacing w:after="80"/>
+        <w:spacing w:after="120"/>
       </w:pPr>
       <w:r>
         <w:rPr>
-          <w:color w:val="1C1714"/>
-          <w:sz w:val="23"/>
+          <w:color w:val="9A9286"/>
+          <w:sz w:val="22"/>
         </w:rPr>
-        <w:t>After the war, the camp's commander, Captain Henry Wirz, was tried and executed — one of the only people executed for war crimes after the Civil War. But historians still debate the fuller question.</w:t>
+        <w:t>____________________________________________________________________________________________</w:t>
       </w:r>
     </w:p>
     <w:p>
       <w:pPr>
-        <w:spacing w:after="80"/>
+        <w:spacing w:after="120"/>
       </w:pPr>
       <w:r>
         <w:rPr>
-          <w:color w:val="1C1714"/>
-          <w:sz w:val="23"/>
+          <w:color w:val="9A9286"/>
+          <w:sz w:val="22"/>
         </w:rPr>
-        <w:t>Was Andersonville the result of deliberate cruelty? Of a collapsing Confederacy that could not feed its own soldiers, let alone prisoners? Of the breakdown of prisoner exchanges on both sides? Assigning blame means weighing evidence carefully — and resisting easy answers.</w:t>
-      </w:r>
-    </w:p>
-    <w:p>
-      <w:r>
-        <w:rPr>
-          <w:i/>
-          <w:color w:val="6A6256"/>
-          <w:sz w:val="17"/>
-        </w:rPr>
-        <w:t>Relics of Andersonville — the “Dead Line” post and prison mail box — photograph, public domain (Library of Congress).</w:t>
-      </w:r>
-    </w:p>
-    <w:p>
-      <w:r>
-        <w:rPr>
-          <w:b/>
-          <w:color w:val="6A6256"/>
-          <w:sz w:val="17"/>
-        </w:rPr>
-        <w:t>A SURVIVING PRISONER, RECALLING ANDERSONVILLE</w:t>
+        <w:t>____________________________________________________________________________________________</w:t>
       </w:r>
     </w:p>
     <w:p>
       <w:pPr>
-        <w:spacing w:after="80"/>
+        <w:spacing w:after="120"/>
       </w:pPr>
       <w:r>
         <w:rPr>
-          <w:color w:val="1C1714"/>
-          <w:sz w:val="23"/>
+          <w:color w:val="9A9286"/>
+          <w:sz w:val="22"/>
         </w:rPr>
-        <w:t>There was no shade … no shelter from the burning sun or the drenching rain. … Men died at the rate of a hundred a day, and we buried them in long trenches, side by side.</w:t>
+        <w:t>____________________________________________________________________________________________</w:t>
       </w:r>
     </w:p>
-    <w:p>
-      <w:pPr>
-        <w:spacing w:before="200"/>
-      </w:pPr>
-      <w:r>
-        <w:rPr>
-          <w:b/>
-          <w:color w:val="B1442F"/>
-          <w:sz w:val="28"/>
-        </w:rPr>
-        <w:t>Suffering, Evidence, and Judgment</w:t>
-      </w:r>
-    </w:p>
-    <w:p>
-      <w:r>
-        <w:rPr>
-          <w:b/>
-          <w:color w:val="6A6256"/>
-          <w:sz w:val="17"/>
-        </w:rPr>
-        <w:t>WHY IT MATTERS</w:t>
-      </w:r>
-    </w:p>
-    <w:p>
-      <w:pPr>
-        <w:spacing w:after="80"/>
-      </w:pPr>
-      <w:r>
-        <w:rPr>
-          <w:color w:val="1C1714"/>
-          <w:sz w:val="23"/>
-        </w:rPr>
-        <w:t>Andersonville forces two historian's habits at once. Historical empathy asks us to understand the real human suffering behind the numbers — without turning it into a horror story for its own sake. And careful use of evidence asks us to assign responsibility fairly, weighing cruelty against collapse.</w:t>
-      </w:r>
-    </w:p>
-    <w:p>
-      <w:pPr>
-        <w:spacing w:after="80"/>
-      </w:pPr>
-      <w:r>
-        <w:rPr>
-          <w:color w:val="1C1714"/>
-          <w:sz w:val="23"/>
-        </w:rPr>
-        <w:t>Both sides' prisons were deadly; Andersonville was the worst. Holding both facts at once — real atrocity, and real complexity — is what mature historical thinking looks like.</w:t>
-      </w:r>
-    </w:p>
-    <w:p>
-      <w:r>
-        <w:rPr>
-          <w:i/>
-          <w:color w:val="6A6256"/>
-          <w:sz w:val="17"/>
-        </w:rPr>
-        <w:t>Andersonville Prison, Georgia — the overcrowded stockade — photograph, August 1864, public domain (Library of Congress).</w:t>
-      </w:r>
-    </w:p>
-    <w:p>
-      <w:pPr>
-        <w:spacing w:before="200"/>
-      </w:pPr>
-      <w:r>
-        <w:rPr>
-          <w:b/>
-          <w:color w:val="B1442F"/>
-          <w:sz w:val="28"/>
-        </w:rPr>
-        <w:t>Weigh the Evidence Fairly</w:t>
-      </w:r>
-    </w:p>
-    <w:p>
-      <w:r>
-        <w:rPr>
-          <w:b/>
-          <w:color w:val="6A6256"/>
-          <w:sz w:val="17"/>
-        </w:rPr>
-        <w:t>YOUR TURN</w:t>
-      </w:r>
-    </w:p>
-    <w:p>
-      <w:r>
-        <w:rPr>
-          <w:i/>
-          <w:color w:val="1C1714"/>
-          <w:sz w:val="22"/>
-        </w:rPr>
-        <w:t>You'll read the photograph and survivor testimony together and practice historical empathy and evidence — understanding the suffering, then judging responsibility without rushing to the easiest answer.</w:t>
-      </w:r>
-    </w:p>
-    <w:p/>
     <w:p>
       <w:pPr>
         <w:jc w:val="center"/>
@@ -498,9 +655,160 @@
         <w:t>Promise &amp; Practice · ShadowDog Digital Studios · Unit 2</w:t>
       </w:r>
     </w:p>
+    <w:p>
+      <w:r>
+        <w:br w:type="page"/>
+      </w:r>
+    </w:p>
+    <w:tbl>
+      <w:tblPr>
+        <w:tblW w:type="auto" w:w="0"/>
+        <w:tblLayout w:type="autofit"/>
+        <w:tblLook w:firstColumn="1" w:firstRow="1" w:lastColumn="0" w:lastRow="0" w:noHBand="0" w:noVBand="1" w:val="04A0"/>
+      </w:tblPr>
+      <w:tblGrid>
+        <w:gridCol w:w="10224"/>
+      </w:tblGrid>
+      <w:tr>
+        <w:tc>
+          <w:tcPr>
+            <w:tcW w:type="dxa" w:w="10224"/>
+            <w:shd w:val="clear" w:fill="2c2219"/>
+          </w:tcPr>
+          <w:p>
+            <w:r>
+              <w:rPr>
+                <w:b/>
+                <w:color w:val="F0A184"/>
+                <w:sz w:val="28"/>
+              </w:rPr>
+              <w:t>TEACHER ANSWER KEY  —  Andersonville — A House Divided</w:t>
+            </w:r>
+          </w:p>
+        </w:tc>
+      </w:tr>
+    </w:tbl>
+    <w:p/>
+    <w:p>
+      <w:r>
+        <w:rPr>
+          <w:b/>
+          <w:color w:val="B1442F"/>
+          <w:sz w:val="22"/>
+        </w:rPr>
+        <w:t xml:space="preserve">QUESTION 1:  </w:t>
+      </w:r>
+      <w:r>
+        <w:rPr>
+          <w:sz w:val="22"/>
+        </w:rPr>
+        <w:t>Open response.</w:t>
+      </w:r>
+    </w:p>
+    <w:p>
+      <w:pPr>
+        <w:ind w:left="432"/>
+      </w:pPr>
+      <w:r>
+        <w:rPr>
+          <w:i/>
+          <w:color w:val="6A6256"/>
+          <w:sz w:val="21"/>
+        </w:rPr>
+        <w:t>Look for a response along the lines of: “Life inside the stockade was… The men lacked…”</w:t>
+      </w:r>
+    </w:p>
+    <w:p>
+      <w:r>
+        <w:rPr>
+          <w:b/>
+          <w:color w:val="B1442F"/>
+          <w:sz w:val="22"/>
+        </w:rPr>
+        <w:t xml:space="preserve">QUESTION 2:  </w:t>
+      </w:r>
+      <w:r>
+        <w:rPr>
+          <w:b/>
+          <w:sz w:val="22"/>
+        </w:rPr>
+        <w:t>Correct — B. a death rate near one in three is powerful evidence of catastrophic, deadly conditions</w:t>
+      </w:r>
+    </w:p>
+    <w:p>
+      <w:pPr>
+        <w:ind w:left="432"/>
+      </w:pPr>
+      <w:r>
+        <w:rPr>
+          <w:i/>
+          <w:color w:val="6A6256"/>
+          <w:sz w:val="21"/>
+        </w:rPr>
+        <w:t>Right. Nearly one in three men dying is overwhelming evidence of catastrophic conditions. A good historian lets the number establish the scale of the suffering before arguing about blame.</w:t>
+      </w:r>
+    </w:p>
+    <w:p>
+      <w:r>
+        <w:rPr>
+          <w:b/>
+          <w:color w:val="B1442F"/>
+          <w:sz w:val="22"/>
+        </w:rPr>
+        <w:t xml:space="preserve">QUESTION 3:  </w:t>
+      </w:r>
+      <w:r>
+        <w:rPr>
+          <w:sz w:val="22"/>
+        </w:rPr>
+        <w:t>Open response.</w:t>
+      </w:r>
+    </w:p>
+    <w:p>
+      <w:pPr>
+        <w:ind w:left="432"/>
+      </w:pPr>
+      <w:r>
+        <w:rPr>
+          <w:i/>
+          <w:color w:val="6A6256"/>
+          <w:sz w:val="21"/>
+        </w:rPr>
+        <w:t>Look for a response along the lines of: “I find ___ most convincing because… To be sure, I would want evidence about…”</w:t>
+      </w:r>
+    </w:p>
+    <w:p>
+      <w:r>
+        <w:rPr>
+          <w:b/>
+          <w:color w:val="B1442F"/>
+          <w:sz w:val="22"/>
+        </w:rPr>
+        <w:t xml:space="preserve">QUESTION 4:  </w:t>
+      </w:r>
+      <w:r>
+        <w:rPr>
+          <w:sz w:val="22"/>
+        </w:rPr>
+        <w:t>Open response.</w:t>
+      </w:r>
+    </w:p>
+    <w:p>
+      <w:pPr>
+        <w:ind w:left="432"/>
+      </w:pPr>
+      <w:r>
+        <w:rPr>
+          <w:i/>
+          <w:color w:val="6A6256"/>
+          <w:sz w:val="21"/>
+        </w:rPr>
+        <w:t>Look for a response along the lines of: “Studying it carefully matters because…”</w:t>
+      </w:r>
+    </w:p>
     <w:sectPr>
       <w:pgSz w:w="12240" w:h="15840"/>
-      <w:pgMar w:top="1152" w:right="1152" w:bottom="1152" w:left="1152" w:header="720" w:footer="720" w:gutter="0"/>
+      <w:pgMar w:top="1008" w:right="1008" w:bottom="1008" w:left="1008" w:header="720" w:footer="720" w:gutter="0"/>
       <w:cols w:space="720"/>
       <w:docGrid w:linePitch="360"/>
     </w:sectPr>

</xml_diff>